<commit_message>
Actualizar informe con resultados finales
</commit_message>
<xml_diff>
--- a/INFORME.docx
+++ b/INFORME.docx
@@ -19,7 +19,7 @@
         <w:t>Estudiante:</w:t>
       </w:r>
       <w:r>
-        <w:t xml:space="preserve"> [Escribe tu nombre]</w:t>
+        <w:t xml:space="preserve"> [Completar]</w:t>
       </w:r>
     </w:p>
     <w:p>
@@ -27,10 +27,10 @@
         <w:rPr>
           <w:b/>
         </w:rPr>
-        <w:t>Código de matrícula:</w:t>
+        <w:t>Matrícula:</w:t>
       </w:r>
       <w:r>
-        <w:t xml:space="preserve"> [Escribe tu código]</w:t>
+        <w:t xml:space="preserve"> [Completar en la copia de entrega, si corresponde]</w:t>
       </w:r>
     </w:p>
     <w:p>
@@ -38,9 +38,11 @@
         <w:rPr>
           <w:b/>
         </w:rPr>
-        <w:t>Semilla utilizada: 76 *(cambiar por los dos últimos dígitos de la matrícula, si corresponde)*</w:t>
+        <w:t>Semilla:</w:t>
       </w:r>
-      <w:r/>
+      <w:r>
+        <w:t xml:space="preserve"> 76</w:t>
+      </w:r>
     </w:p>
     <w:p>
       <w:r>
@@ -65,42 +67,6 @@
       </w:r>
     </w:p>
     <w:p>
-      <w:r>
-        <w:rPr>
-          <w:b/>
-        </w:rPr>
-        <w:t>Fecha:</w:t>
-      </w:r>
-      <w:r>
-        <w:t xml:space="preserve"> [Escribe la fecha de entrega]</w:t>
-      </w:r>
-    </w:p>
-    <w:p>
-      <w:pPr>
-        <w:pStyle w:val="Quote"/>
-        <w:ind w:left="288" w:right="288"/>
-      </w:pPr>
-      <w:r>
-        <w:rPr>
-          <w:b/>
-        </w:rPr>
-        <w:t>Pendiente antes de entregar:</w:t>
-      </w:r>
-      <w:r>
-        <w:t xml:space="preserve"> completar la sección de resultados con la salida real de </w:t>
-      </w:r>
-      <w:r>
-        <w:rPr>
-          <w:rFonts w:ascii="Consolas" w:hAnsi="Consolas"/>
-          <w:sz w:val="18"/>
-        </w:rPr>
-        <w:t>python src\train.py</w:t>
-      </w:r>
-      <w:r>
-        <w:t>, revisar que las figuras existan y reemplazar los campos entre corchetes. No se deben presentar valores estimados como resultados experimentales.</w:t>
-      </w:r>
-    </w:p>
-    <w:p>
       <w:pPr>
         <w:pStyle w:val="Heading1"/>
       </w:pPr>
@@ -110,21 +76,16 @@
     </w:p>
     <w:p>
       <w:r>
-        <w:t>Este trabajo implementa un clasificador de imágenes para CIFAR-10 mediante una red neuronal convolucional (CNN) construida con PyTorch. El flujo incluye la carga y exploración visual del dataset, transformaciones de imágenes, una partición estratificada de entrenamiento y validación, la definición de la arquitectura y la evaluación sobre el conjunto de prueba independiente. El entrenamiento utiliza la función de pérdida CrossEntropyLoss y el optimizador Adam.</w:t>
-      </w:r>
-    </w:p>
-    <w:p>
-      <w:r>
-        <w:t xml:space="preserve">La precisión final obtenida en el conjunto de prueba fue </w:t>
+        <w:t xml:space="preserve">Se implementó una red neuronal convolucional (CNN) en PyTorch para clasificar imágenes RGB del dataset CIFAR-10 en diez categorías. El flujo incluye aumento de datos para entrenamiento, una partición estratificada de entrenamiento y validación, evaluación sobre el conjunto de prueba independiente y análisis mediante curvas de aprendizaje y matriz de confusión. La accuracy obtenida en prueba fue </w:t>
       </w:r>
       <w:r>
         <w:rPr>
           <w:b/>
         </w:rPr>
-        <w:t>[completar] %</w:t>
+        <w:t>73.37 %</w:t>
       </w:r>
       <w:r>
-        <w:t>. El análisis de las curvas de aprendizaje y de la matriz de confusión se completa con los resultados generados durante la ejecución.</w:t>
+        <w:t>.</w:t>
       </w:r>
     </w:p>
     <w:p>
@@ -132,17 +93,47 @@
         <w:pStyle w:val="Heading1"/>
       </w:pPr>
       <w:r>
-        <w:t>1. Introducción</w:t>
+        <w:t>Objetivos</w:t>
       </w:r>
     </w:p>
     <w:p>
+      <w:pPr>
+        <w:pStyle w:val="ListBullet"/>
+      </w:pPr>
       <w:r>
-        <w:t>La clasificación de imágenes consiste en asignar una etiqueta a una imagen de acuerdo con su contenido visual. CIFAR-10 es un dataset de referencia compuesto por imágenes RGB de 32 × 32 píxeles distribuidas en diez categorías. Debido a que las imágenes contienen variaciones de posición, forma, color y fondo, el problema permite observar cómo una CNN aprende características visuales a partir de ejemplos etiquetados.</w:t>
+        <w:t>Cargar CIFAR-10 y visualizar imágenes con sus etiquetas.</w:t>
       </w:r>
     </w:p>
     <w:p>
+      <w:pPr>
+        <w:pStyle w:val="ListBullet"/>
+      </w:pPr>
       <w:r>
-        <w:t>El objetivo de esta evaluación es preparar los datos de manera reproducible, implementar una CNN con dimensiones compatibles y analizar su desempeño mediante métricas de entrenamiento, validación y prueba.</w:t>
+        <w:t>Aplicar transformaciones y aumento de datos al conjunto de entrenamiento.</w:t>
+      </w:r>
+    </w:p>
+    <w:p>
+      <w:pPr>
+        <w:pStyle w:val="ListBullet"/>
+      </w:pPr>
+      <w:r>
+        <w:t>Separar entrenamiento y validación de forma estratificada.</w:t>
+      </w:r>
+    </w:p>
+    <w:p>
+      <w:pPr>
+        <w:pStyle w:val="ListBullet"/>
+      </w:pPr>
+      <w:r>
+        <w:t>Implementar y validar las dimensiones de entrada y salida de una CNN.</w:t>
+      </w:r>
+    </w:p>
+    <w:p>
+      <w:pPr>
+        <w:pStyle w:val="ListBullet"/>
+      </w:pPr>
+      <w:r>
+        <w:t>Entrenar y evaluar el modelo e interpretar las métricas obtenidas.</w:t>
       </w:r>
     </w:p>
     <w:p>
@@ -150,76 +141,12 @@
         <w:pStyle w:val="Heading1"/>
       </w:pPr>
       <w:r>
-        <w:t>2. Objetivos</w:t>
-      </w:r>
-    </w:p>
-    <w:p>
-      <w:pPr>
-        <w:pStyle w:val="Heading2"/>
-      </w:pPr>
-      <w:r>
-        <w:t>Objetivo general</w:t>
+        <w:t>Fundamento teórico</w:t>
       </w:r>
     </w:p>
     <w:p>
       <w:r>
-        <w:t>Desarrollar y evaluar una CNN capaz de clasificar imágenes del dataset CIFAR-10.</w:t>
-      </w:r>
-    </w:p>
-    <w:p>
-      <w:pPr>
-        <w:pStyle w:val="Heading2"/>
-      </w:pPr>
-      <w:r>
-        <w:t>Objetivos específicos</w:t>
-      </w:r>
-    </w:p>
-    <w:p>
-      <w:pPr>
-        <w:pStyle w:val="ListBullet"/>
-      </w:pPr>
-      <w:r>
-        <w:t>Cargar CIFAR-10 y visualizar ejemplos con sus etiquetas.</w:t>
-      </w:r>
-    </w:p>
-    <w:p>
-      <w:pPr>
-        <w:pStyle w:val="ListBullet"/>
-      </w:pPr>
-      <w:r>
-        <w:t>Aplicar normalización y aumento de datos al conjunto de entrenamiento.</w:t>
-      </w:r>
-    </w:p>
-    <w:p>
-      <w:pPr>
-        <w:pStyle w:val="ListBullet"/>
-      </w:pPr>
-      <w:r>
-        <w:t>Separar el conjunto de entrenamiento original en subconjuntos de entrenamiento y validación mediante muestreo estratificado.</w:t>
-      </w:r>
-    </w:p>
-    <w:p>
-      <w:pPr>
-        <w:pStyle w:val="ListBullet"/>
-      </w:pPr>
-      <w:r>
-        <w:t>Implementar y comprobar el flujo de tensores 4D de una CNN.</w:t>
-      </w:r>
-    </w:p>
-    <w:p>
-      <w:pPr>
-        <w:pStyle w:val="ListBullet"/>
-      </w:pPr>
-      <w:r>
-        <w:t>Entrenar el modelo y evaluar su desempeño sobre el conjunto de prueba.</w:t>
-      </w:r>
-    </w:p>
-    <w:p>
-      <w:pPr>
-        <w:pStyle w:val="ListBullet"/>
-      </w:pPr>
-      <w:r>
-        <w:t>Interpretar las curvas de aprendizaje y la matriz de confusión a partir de los resultados observados.</w:t>
+        <w:t>Al aplanar una imagen CIFAR-10 se obtienen 3072 valores y se pierde la estructura espacial explícita de los píxeles. En un MLP, las capas densas conectan cada valor de entrada con numerosas neuronas, lo que aumenta el número de parámetros. Una CNN conserva la estructura espacial mediante filtros con conexiones locales y reutilización de pesos (*weight sharing*), reduciendo parámetros respecto de conexiones densas equivalentes. El pooling disminuye las dimensiones espaciales y ayuda a conservar características destacadas. Estas propiedades hacen que las CNN sean adecuadas para imágenes.</w:t>
       </w:r>
     </w:p>
     <w:p>
@@ -227,91 +154,12 @@
         <w:pStyle w:val="Heading1"/>
       </w:pPr>
       <w:r>
-        <w:t>3. Fundamento teórico</w:t>
+        <w:t>Dataset y preparación</w:t>
       </w:r>
     </w:p>
     <w:p>
       <w:r>
-        <w:t>Una imagen RGB de CIFAR-10 tiene 32 × 32 × 3 = 3072 valores por imagen. Un MLP puede recibir esos valores aplanados, pero pierde explícitamente la disposición espacial de los píxeles. Además, las capas densas conectan cada entrada con muchas neuronas, lo que puede incrementar el número de parámetros y el costo computacional.</w:t>
-      </w:r>
-    </w:p>
-    <w:p>
-      <w:r>
-        <w:t>Las CNN aprovechan la estructura espacial de las imágenes mediante:</w:t>
-      </w:r>
-    </w:p>
-    <w:p>
-      <w:pPr>
-        <w:pStyle w:val="ListBullet"/>
-      </w:pPr>
-      <w:r>
-        <w:rPr>
-          <w:b/>
-        </w:rPr>
-        <w:t>Conexiones locales:</w:t>
-      </w:r>
-      <w:r>
-        <w:t xml:space="preserve"> los filtros analizan vecindarios pequeños y detectan patrones como bordes o texturas.</w:t>
-      </w:r>
-    </w:p>
-    <w:p>
-      <w:pPr>
-        <w:pStyle w:val="ListBullet"/>
-      </w:pPr>
-      <w:r>
-        <w:rPr>
-          <w:b/>
-        </w:rPr>
-        <w:t>Compartición de pesos (weight sharing):</w:t>
-      </w:r>
-      <w:r>
-        <w:t xml:space="preserve"> cada filtro reutiliza sus parámetros en distintas ubicaciones, reduciendo el número de parámetros frente a conexiones densas equivalentes.</w:t>
-      </w:r>
-    </w:p>
-    <w:p>
-      <w:pPr>
-        <w:pStyle w:val="ListBullet"/>
-      </w:pPr>
-      <w:r>
-        <w:rPr>
-          <w:b/>
-        </w:rPr>
-        <w:t>Submuestreo:</w:t>
-      </w:r>
-      <w:r>
-        <w:t xml:space="preserve"> MaxPool2d reduce las dimensiones espaciales y conserva respuestas destacadas.</w:t>
-      </w:r>
-    </w:p>
-    <w:p>
-      <w:pPr>
-        <w:pStyle w:val="ListBullet"/>
-      </w:pPr>
-      <w:r>
-        <w:rPr>
-          <w:b/>
-        </w:rPr>
-        <w:t>Tolerancia a desplazamientos pequeños:</w:t>
-      </w:r>
-      <w:r>
-        <w:t xml:space="preserve"> las convoluciones y el pooling ayudan a reconocer patrones aunque cambien moderadamente de posición. Esto no implica invariancia perfecta.</w:t>
-      </w:r>
-    </w:p>
-    <w:p>
-      <w:r>
-        <w:t>Por estas razones, una CNN conserva y aprovecha mejor la estructura de una imagen que un MLP que la aplana desde el inicio.</w:t>
-      </w:r>
-    </w:p>
-    <w:p>
-      <w:pPr>
-        <w:pStyle w:val="Heading1"/>
-      </w:pPr>
-      <w:r>
-        <w:t>4. Dataset y preparación de los datos</w:t>
-      </w:r>
-    </w:p>
-    <w:p>
-      <w:r>
-        <w:t xml:space="preserve">CIFAR-10 incluye las clases </w:t>
+        <w:t xml:space="preserve">CIFAR-10 contiene 50 000 imágenes de entrenamiento y 10 000 de prueba, distribuidas en </w:t>
       </w:r>
       <w:r>
         <w:rPr>
@@ -411,43 +259,13 @@
         <w:t>truck</w:t>
       </w:r>
       <w:r>
-        <w:t>. El conjunto oficial de entrenamiento contiene 50 000 imágenes y el conjunto oficial de prueba contiene 10 000.</w:t>
+        <w:t>. El conjunto de entrenamiento se dividió en 40 000 imágenes de entrenamiento y 10 000 de validación mediante partición estratificada. El conjunto de prueba se mantuvo independiente.</w:t>
       </w:r>
     </w:p>
     <w:p>
       <w:r>
-        <w:t xml:space="preserve">El proyecto separa el conjunto oficial de entrenamiento en entrenamiento y validación, conservando la proporción de las clases mediante </w:t>
+        <w:t xml:space="preserve">Para entrenamiento se usaron </w:t>
       </w:r>
-      <w:r>
-        <w:rPr>
-          <w:rFonts w:ascii="Consolas" w:hAnsi="Consolas"/>
-          <w:sz w:val="18"/>
-        </w:rPr>
-        <w:t>train_test_split</w:t>
-      </w:r>
-      <w:r>
-        <w:t xml:space="preserve"> con </w:t>
-      </w:r>
-      <w:r>
-        <w:rPr>
-          <w:rFonts w:ascii="Consolas" w:hAnsi="Consolas"/>
-          <w:sz w:val="18"/>
-        </w:rPr>
-        <w:t>stratify</w:t>
-      </w:r>
-      <w:r>
-        <w:t>. Con una partición de validación del 20 %, se esperan 40 000 imágenes para entrenamiento y 10 000 para validación; el conjunto de prueba permanece independiente con 10 000 imágenes.</w:t>
-      </w:r>
-    </w:p>
-    <w:p>
-      <w:r>
-        <w:t>Las transformaciones para entrenamiento incluyen:</w:t>
-      </w:r>
-    </w:p>
-    <w:p>
-      <w:pPr>
-        <w:pStyle w:val="ListNumber"/>
-      </w:pPr>
       <w:r>
         <w:rPr>
           <w:rFonts w:ascii="Consolas" w:hAnsi="Consolas"/>
@@ -456,13 +274,8 @@
         <w:t>RandomCrop(32, padding=4)</w:t>
       </w:r>
       <w:r>
-        <w:t xml:space="preserve"> para generar recortes aleatorios con relleno.</w:t>
+        <w:t xml:space="preserve">, </w:t>
       </w:r>
-    </w:p>
-    <w:p>
-      <w:pPr>
-        <w:pStyle w:val="ListNumber"/>
-      </w:pPr>
       <w:r>
         <w:rPr>
           <w:rFonts w:ascii="Consolas" w:hAnsi="Consolas"/>
@@ -471,13 +284,8 @@
         <w:t>RandomHorizontalFlip()</w:t>
       </w:r>
       <w:r>
-        <w:t xml:space="preserve"> para invertir horizontalmente algunas imágenes.</w:t>
+        <w:t xml:space="preserve">, </w:t>
       </w:r>
-    </w:p>
-    <w:p>
-      <w:pPr>
-        <w:pStyle w:val="ListNumber"/>
-      </w:pPr>
       <w:r>
         <w:rPr>
           <w:rFonts w:ascii="Consolas" w:hAnsi="Consolas"/>
@@ -486,37 +294,7 @@
         <w:t>ToTensor()</w:t>
       </w:r>
       <w:r>
-        <w:t xml:space="preserve"> para convertir las imágenes a tensores.</w:t>
-      </w:r>
-    </w:p>
-    <w:p>
-      <w:pPr>
-        <w:pStyle w:val="ListNumber"/>
-      </w:pPr>
-      <w:r>
-        <w:rPr>
-          <w:rFonts w:ascii="Consolas" w:hAnsi="Consolas"/>
-          <w:sz w:val="18"/>
-        </w:rPr>
-        <w:t>Normalize(...)</w:t>
-      </w:r>
-      <w:r>
-        <w:t xml:space="preserve"> para normalizar los tres canales RGB.</w:t>
-      </w:r>
-    </w:p>
-    <w:p>
-      <w:r>
-        <w:t xml:space="preserve">Para validación y prueba se usa conversión a tensor y normalización, sin aumento aleatorio. La cuadrícula de ejemplos se genera en </w:t>
-      </w:r>
-      <w:r>
-        <w:rPr>
-          <w:rFonts w:ascii="Consolas" w:hAnsi="Consolas"/>
-          <w:sz w:val="18"/>
-        </w:rPr>
-        <w:t>outputs/dataset_samples.png</w:t>
-      </w:r>
-      <w:r>
-        <w:t>.</w:t>
+        <w:t xml:space="preserve"> y normalización RGB. En validación y prueba se aplicaron conversión a tensor y normalización, sin aumento aleatorio. Se fijó la semilla 76 en PyTorch y NumPy.</w:t>
       </w:r>
     </w:p>
     <w:p>
@@ -524,16 +302,17 @@
         <w:pStyle w:val="Heading1"/>
       </w:pPr>
       <w:r>
-        <w:t>5. Arquitectura de la CNN</w:t>
+        <w:t>Arquitectura</w:t>
       </w:r>
     </w:p>
     <w:p>
       <w:r>
-        <w:t xml:space="preserve">La entrada del modelo tiene la forma </w:t>
+        <w:t xml:space="preserve">La entrada es un tensor de forma </w:t>
       </w:r>
       <w:r>
         <w:rPr>
-          <w:b/>
+          <w:rFonts w:ascii="Consolas" w:hAnsi="Consolas"/>
+          <w:sz w:val="18"/>
         </w:rPr>
         <w:t>[B, 3, 32, 32]</w:t>
       </w:r>
@@ -548,17 +327,7 @@
         <w:t>B</w:t>
       </w:r>
       <w:r>
-        <w:t xml:space="preserve"> es el tamaño del lote, </w:t>
-      </w:r>
-      <w:r>
-        <w:rPr>
-          <w:rFonts w:ascii="Consolas" w:hAnsi="Consolas"/>
-          <w:sz w:val="18"/>
-        </w:rPr>
-        <w:t>3</w:t>
-      </w:r>
-      <w:r>
-        <w:t xml:space="preserve"> representa los canales RGB y las dimensiones espaciales son 32 × 32.</w:t>
+        <w:t xml:space="preserve"> es el tamaño del lote.</w:t>
       </w:r>
     </w:p>
     <w:tbl>
@@ -608,7 +377,7 @@
                 <w:b/>
                 <w:sz w:val="17"/>
               </w:rPr>
-              <w:t>Operación</w:t>
+              <w:t>Operaciones</w:t>
             </w:r>
           </w:p>
         </w:tc>
@@ -627,7 +396,7 @@
                 <w:b/>
                 <w:sz w:val="17"/>
               </w:rPr>
-              <w:t>Forma de salida para una entrada `[B, 3, 32, 32]`</w:t>
+              <w:t>Forma de salida</w:t>
             </w:r>
           </w:p>
         </w:tc>
@@ -721,7 +490,7 @@
                 <w:rFonts w:ascii="Arial" w:hAnsi="Arial"/>
                 <w:sz w:val="17"/>
               </w:rPr>
-              <w:t>Conv2d(3, 32, 3, padding=1) + ReLU + MaxPool2d(2)</w:t>
+              <w:t>Conv2d(3, 32, 3, padding=1), ReLU, MaxPool2d(2)</w:t>
             </w:r>
           </w:p>
         </w:tc>
@@ -777,7 +546,7 @@
                 <w:rFonts w:ascii="Arial" w:hAnsi="Arial"/>
                 <w:sz w:val="17"/>
               </w:rPr>
-              <w:t>Conv2d(32, 64, 3, padding=1) + ReLU + MaxPool2d(2)</w:t>
+              <w:t>Conv2d(32, 64, 3, padding=1), ReLU, MaxPool2d(2)</w:t>
             </w:r>
           </w:p>
         </w:tc>
@@ -889,7 +658,7 @@
                 <w:rFonts w:ascii="Arial" w:hAnsi="Arial"/>
                 <w:sz w:val="17"/>
               </w:rPr>
-              <w:t>Linear(4096, 256) + ReLU</w:t>
+              <w:t>Linear(4096, 256), ReLU</w:t>
             </w:r>
           </w:p>
         </w:tc>
@@ -972,42 +741,7 @@
     <w:p/>
     <w:p>
       <w:r>
-        <w:t>La salida contiene diez logits por imagen, uno para cada clase. CrossEntropyLoss recibe estos logits junto con las etiquetas enteras; no se aplica Softmax explícitamente antes de la pérdida.</w:t>
-      </w:r>
-    </w:p>
-    <w:p>
-      <w:r>
-        <w:t xml:space="preserve">La prueba de formas de </w:t>
-      </w:r>
-      <w:r>
-        <w:rPr>
-          <w:rFonts w:ascii="Consolas" w:hAnsi="Consolas"/>
-          <w:sz w:val="18"/>
-        </w:rPr>
-        <w:t>src/model.py</w:t>
-      </w:r>
-      <w:r>
-        <w:t xml:space="preserve"> debe mostrar, para un lote simulado de cuatro imágenes, una entrada </w:t>
-      </w:r>
-      <w:r>
-        <w:rPr>
-          <w:rFonts w:ascii="Consolas" w:hAnsi="Consolas"/>
-          <w:sz w:val="18"/>
-        </w:rPr>
-        <w:t>[4, 3, 32, 32]</w:t>
-      </w:r>
-      <w:r>
-        <w:t xml:space="preserve">, una salida convolucional </w:t>
-      </w:r>
-      <w:r>
-        <w:rPr>
-          <w:rFonts w:ascii="Consolas" w:hAnsi="Consolas"/>
-          <w:sz w:val="18"/>
-        </w:rPr>
-        <w:t>[4, 64, 8, 8]</w:t>
-      </w:r>
-      <w:r>
-        <w:t xml:space="preserve"> y una salida final </w:t>
+        <w:t xml:space="preserve">La prueba con un lote simulado de cuatro imágenes valida la salida </w:t>
       </w:r>
       <w:r>
         <w:rPr>
@@ -1025,7 +759,7 @@
         <w:pStyle w:val="Heading1"/>
       </w:pPr>
       <w:r>
-        <w:t>6. Configuración experimental</w:t>
+        <w:t>Configuración</w:t>
       </w:r>
     </w:p>
     <w:tbl>
@@ -1112,7 +846,7 @@
                 <w:rFonts w:ascii="Arial" w:hAnsi="Arial"/>
                 <w:sz w:val="17"/>
               </w:rPr>
-              <w:t>76 *(confirmar con la matrícula)*</w:t>
+              <w:t>76</w:t>
             </w:r>
           </w:p>
         </w:tc>
@@ -1132,7 +866,7 @@
                 <w:rFonts w:ascii="Arial" w:hAnsi="Arial"/>
                 <w:sz w:val="17"/>
               </w:rPr>
-              <w:t>Tamaño del lote</w:t>
+              <w:t>Tamaño de lote</w:t>
             </w:r>
           </w:p>
         </w:tc>
@@ -1170,7 +904,7 @@
                 <w:rFonts w:ascii="Arial" w:hAnsi="Arial"/>
                 <w:sz w:val="17"/>
               </w:rPr>
-              <w:t>Número de épocas</w:t>
+              <w:t>Épocas</w:t>
             </w:r>
           </w:p>
         </w:tc>
@@ -1322,44 +1056,6 @@
                 <w:rFonts w:ascii="Arial" w:hAnsi="Arial"/>
                 <w:sz w:val="17"/>
               </w:rPr>
-              <w:t>Dispositivo</w:t>
-            </w:r>
-          </w:p>
-        </w:tc>
-        <w:tc>
-          <w:tcPr>
-            <w:tcW w:type="dxa" w:w="4968"/>
-            <w:vAlign w:val="center"/>
-          </w:tcPr>
-          <w:p>
-            <w:pPr>
-              <w:spacing w:after="40"/>
-            </w:pPr>
-            <w:r>
-              <w:rPr>
-                <w:rFonts w:ascii="Arial" w:hAnsi="Arial"/>
-                <w:sz w:val="17"/>
-              </w:rPr>
-              <w:t>[CPU o CUDA, según la salida del programa]</w:t>
-            </w:r>
-          </w:p>
-        </w:tc>
-      </w:tr>
-      <w:tr>
-        <w:tc>
-          <w:tcPr>
-            <w:tcW w:type="dxa" w:w="4968"/>
-            <w:vAlign w:val="center"/>
-          </w:tcPr>
-          <w:p>
-            <w:pPr>
-              <w:spacing w:after="40"/>
-            </w:pPr>
-            <w:r>
-              <w:rPr>
-                <w:rFonts w:ascii="Arial" w:hAnsi="Arial"/>
-                <w:sz w:val="17"/>
-              </w:rPr>
               <w:t>Partición entrenamiento/validación</w:t>
             </w:r>
           </w:p>
@@ -1378,7 +1074,7 @@
                 <w:rFonts w:ascii="Arial" w:hAnsi="Arial"/>
                 <w:sz w:val="17"/>
               </w:rPr>
-              <w:t>80 % / 20 % del conjunto oficial de entrenamiento</w:t>
+              <w:t>80 % / 20 %</w:t>
             </w:r>
           </w:p>
         </w:tc>
@@ -1386,49 +1082,11 @@
     </w:tbl>
     <w:p/>
     <w:p>
-      <w:r>
-        <w:t>La semilla se aplica a PyTorch y NumPy. Debe corresponder a los dos últimos dígitos del código de matrícula para satisfacer la instrucción de individualización.</w:t>
-      </w:r>
-    </w:p>
-    <w:p>
       <w:pPr>
         <w:pStyle w:val="Heading1"/>
       </w:pPr>
       <w:r>
-        <w:t>7. Resultados</w:t>
-      </w:r>
-    </w:p>
-    <w:p>
-      <w:r>
-        <w:t xml:space="preserve">Completar esta sección después de que </w:t>
-      </w:r>
-      <w:r>
-        <w:rPr>
-          <w:rFonts w:ascii="Consolas" w:hAnsi="Consolas"/>
-          <w:sz w:val="18"/>
-        </w:rPr>
-        <w:t>python src\train.py</w:t>
-      </w:r>
-      <w:r>
-        <w:t xml:space="preserve"> termine correctamente. Copiar las métricas de la terminal y revisar las figuras guardadas en </w:t>
-      </w:r>
-      <w:r>
-        <w:rPr>
-          <w:rFonts w:ascii="Consolas" w:hAnsi="Consolas"/>
-          <w:sz w:val="18"/>
-        </w:rPr>
-        <w:t>outputs/</w:t>
-      </w:r>
-      <w:r>
-        <w:t>.</w:t>
-      </w:r>
-    </w:p>
-    <w:p>
-      <w:pPr>
-        <w:pStyle w:val="Heading2"/>
-      </w:pPr>
-      <w:r>
-        <w:t>Métricas por época</w:t>
+        <w:t>Resultados</w:t>
       </w:r>
     </w:p>
     <w:tbl>
@@ -1575,7 +1233,7 @@
                 <w:rFonts w:ascii="Arial" w:hAnsi="Arial"/>
                 <w:sz w:val="17"/>
               </w:rPr>
-              <w:t>[ ]</w:t>
+              <w:t>1.4957</w:t>
             </w:r>
           </w:p>
         </w:tc>
@@ -1593,7 +1251,7 @@
                 <w:rFonts w:ascii="Arial" w:hAnsi="Arial"/>
                 <w:sz w:val="17"/>
               </w:rPr>
-              <w:t>[ ]</w:t>
+              <w:t>0.4576</w:t>
             </w:r>
           </w:p>
         </w:tc>
@@ -1611,7 +1269,7 @@
                 <w:rFonts w:ascii="Arial" w:hAnsi="Arial"/>
                 <w:sz w:val="17"/>
               </w:rPr>
-              <w:t>[ ]</w:t>
+              <w:t>1.2839</w:t>
             </w:r>
           </w:p>
         </w:tc>
@@ -1629,7 +1287,7 @@
                 <w:rFonts w:ascii="Arial" w:hAnsi="Arial"/>
                 <w:sz w:val="17"/>
               </w:rPr>
-              <w:t>[ ]</w:t>
+              <w:t>0.5414</w:t>
             </w:r>
           </w:p>
         </w:tc>
@@ -1667,7 +1325,7 @@
                 <w:rFonts w:ascii="Arial" w:hAnsi="Arial"/>
                 <w:sz w:val="17"/>
               </w:rPr>
-              <w:t>[ ]</w:t>
+              <w:t>1.1588</w:t>
             </w:r>
           </w:p>
         </w:tc>
@@ -1685,7 +1343,7 @@
                 <w:rFonts w:ascii="Arial" w:hAnsi="Arial"/>
                 <w:sz w:val="17"/>
               </w:rPr>
-              <w:t>[ ]</w:t>
+              <w:t>0.5851</w:t>
             </w:r>
           </w:p>
         </w:tc>
@@ -1703,7 +1361,7 @@
                 <w:rFonts w:ascii="Arial" w:hAnsi="Arial"/>
                 <w:sz w:val="17"/>
               </w:rPr>
-              <w:t>[ ]</w:t>
+              <w:t>1.1314</w:t>
             </w:r>
           </w:p>
         </w:tc>
@@ -1721,7 +1379,7 @@
                 <w:rFonts w:ascii="Arial" w:hAnsi="Arial"/>
                 <w:sz w:val="17"/>
               </w:rPr>
-              <w:t>[ ]</w:t>
+              <w:t>0.5944</w:t>
             </w:r>
           </w:p>
         </w:tc>
@@ -1759,7 +1417,7 @@
                 <w:rFonts w:ascii="Arial" w:hAnsi="Arial"/>
                 <w:sz w:val="17"/>
               </w:rPr>
-              <w:t>[ ]</w:t>
+              <w:t>1.0307</w:t>
             </w:r>
           </w:p>
         </w:tc>
@@ -1777,7 +1435,7 @@
                 <w:rFonts w:ascii="Arial" w:hAnsi="Arial"/>
                 <w:sz w:val="17"/>
               </w:rPr>
-              <w:t>[ ]</w:t>
+              <w:t>0.6338</w:t>
             </w:r>
           </w:p>
         </w:tc>
@@ -1795,7 +1453,7 @@
                 <w:rFonts w:ascii="Arial" w:hAnsi="Arial"/>
                 <w:sz w:val="17"/>
               </w:rPr>
-              <w:t>[ ]</w:t>
+              <w:t>1.0394</w:t>
             </w:r>
           </w:p>
         </w:tc>
@@ -1813,7 +1471,7 @@
                 <w:rFonts w:ascii="Arial" w:hAnsi="Arial"/>
                 <w:sz w:val="17"/>
               </w:rPr>
-              <w:t>[ ]</w:t>
+              <w:t>0.6321</w:t>
             </w:r>
           </w:p>
         </w:tc>
@@ -1851,7 +1509,7 @@
                 <w:rFonts w:ascii="Arial" w:hAnsi="Arial"/>
                 <w:sz w:val="17"/>
               </w:rPr>
-              <w:t>[ ]</w:t>
+              <w:t>0.9549</w:t>
             </w:r>
           </w:p>
         </w:tc>
@@ -1869,7 +1527,7 @@
                 <w:rFonts w:ascii="Arial" w:hAnsi="Arial"/>
                 <w:sz w:val="17"/>
               </w:rPr>
-              <w:t>[ ]</w:t>
+              <w:t>0.6634</w:t>
             </w:r>
           </w:p>
         </w:tc>
@@ -1887,7 +1545,7 @@
                 <w:rFonts w:ascii="Arial" w:hAnsi="Arial"/>
                 <w:sz w:val="17"/>
               </w:rPr>
-              <w:t>[ ]</w:t>
+              <w:t>0.9706</w:t>
             </w:r>
           </w:p>
         </w:tc>
@@ -1905,7 +1563,7 @@
                 <w:rFonts w:ascii="Arial" w:hAnsi="Arial"/>
                 <w:sz w:val="17"/>
               </w:rPr>
-              <w:t>[ ]</w:t>
+              <w:t>0.6619</w:t>
             </w:r>
           </w:p>
         </w:tc>
@@ -1943,7 +1601,7 @@
                 <w:rFonts w:ascii="Arial" w:hAnsi="Arial"/>
                 <w:sz w:val="17"/>
               </w:rPr>
-              <w:t>[ ]</w:t>
+              <w:t>0.8919</w:t>
             </w:r>
           </w:p>
         </w:tc>
@@ -1961,7 +1619,7 @@
                 <w:rFonts w:ascii="Arial" w:hAnsi="Arial"/>
                 <w:sz w:val="17"/>
               </w:rPr>
-              <w:t>[ ]</w:t>
+              <w:t>0.6872</w:t>
             </w:r>
           </w:p>
         </w:tc>
@@ -1979,7 +1637,7 @@
                 <w:rFonts w:ascii="Arial" w:hAnsi="Arial"/>
                 <w:sz w:val="17"/>
               </w:rPr>
-              <w:t>[ ]</w:t>
+              <w:t>0.9267</w:t>
             </w:r>
           </w:p>
         </w:tc>
@@ -1997,7 +1655,7 @@
                 <w:rFonts w:ascii="Arial" w:hAnsi="Arial"/>
                 <w:sz w:val="17"/>
               </w:rPr>
-              <w:t>[ ]</w:t>
+              <w:t>0.6710</w:t>
             </w:r>
           </w:p>
         </w:tc>
@@ -2035,7 +1693,7 @@
                 <w:rFonts w:ascii="Arial" w:hAnsi="Arial"/>
                 <w:sz w:val="17"/>
               </w:rPr>
-              <w:t>[ ]</w:t>
+              <w:t>0.8455</w:t>
             </w:r>
           </w:p>
         </w:tc>
@@ -2053,7 +1711,7 @@
                 <w:rFonts w:ascii="Arial" w:hAnsi="Arial"/>
                 <w:sz w:val="17"/>
               </w:rPr>
-              <w:t>[ ]</w:t>
+              <w:t>0.7059</w:t>
             </w:r>
           </w:p>
         </w:tc>
@@ -2071,7 +1729,7 @@
                 <w:rFonts w:ascii="Arial" w:hAnsi="Arial"/>
                 <w:sz w:val="17"/>
               </w:rPr>
-              <w:t>[ ]</w:t>
+              <w:t>0.8623</w:t>
             </w:r>
           </w:p>
         </w:tc>
@@ -2089,7 +1747,7 @@
                 <w:rFonts w:ascii="Arial" w:hAnsi="Arial"/>
                 <w:sz w:val="17"/>
               </w:rPr>
-              <w:t>[ ]</w:t>
+              <w:t>0.7011</w:t>
             </w:r>
           </w:p>
         </w:tc>
@@ -2127,7 +1785,7 @@
                 <w:rFonts w:ascii="Arial" w:hAnsi="Arial"/>
                 <w:sz w:val="17"/>
               </w:rPr>
-              <w:t>[ ]</w:t>
+              <w:t>0.8023</w:t>
             </w:r>
           </w:p>
         </w:tc>
@@ -2145,7 +1803,7 @@
                 <w:rFonts w:ascii="Arial" w:hAnsi="Arial"/>
                 <w:sz w:val="17"/>
               </w:rPr>
-              <w:t>[ ]</w:t>
+              <w:t>0.7204</w:t>
             </w:r>
           </w:p>
         </w:tc>
@@ -2163,7 +1821,7 @@
                 <w:rFonts w:ascii="Arial" w:hAnsi="Arial"/>
                 <w:sz w:val="17"/>
               </w:rPr>
-              <w:t>[ ]</w:t>
+              <w:t>0.8860</w:t>
             </w:r>
           </w:p>
         </w:tc>
@@ -2181,7 +1839,7 @@
                 <w:rFonts w:ascii="Arial" w:hAnsi="Arial"/>
                 <w:sz w:val="17"/>
               </w:rPr>
-              <w:t>[ ]</w:t>
+              <w:t>0.6896</w:t>
             </w:r>
           </w:p>
         </w:tc>
@@ -2219,7 +1877,7 @@
                 <w:rFonts w:ascii="Arial" w:hAnsi="Arial"/>
                 <w:sz w:val="17"/>
               </w:rPr>
-              <w:t>[ ]</w:t>
+              <w:t>0.7742</w:t>
             </w:r>
           </w:p>
         </w:tc>
@@ -2237,7 +1895,7 @@
                 <w:rFonts w:ascii="Arial" w:hAnsi="Arial"/>
                 <w:sz w:val="17"/>
               </w:rPr>
-              <w:t>[ ]</w:t>
+              <w:t>0.7264</w:t>
             </w:r>
           </w:p>
         </w:tc>
@@ -2255,7 +1913,7 @@
                 <w:rFonts w:ascii="Arial" w:hAnsi="Arial"/>
                 <w:sz w:val="17"/>
               </w:rPr>
-              <w:t>[ ]</w:t>
+              <w:t>0.8467</w:t>
             </w:r>
           </w:p>
         </w:tc>
@@ -2273,7 +1931,7 @@
                 <w:rFonts w:ascii="Arial" w:hAnsi="Arial"/>
                 <w:sz w:val="17"/>
               </w:rPr>
-              <w:t>[ ]</w:t>
+              <w:t>0.7030</w:t>
             </w:r>
           </w:p>
         </w:tc>
@@ -2285,50 +1943,20 @@
         <w:rPr>
           <w:b/>
         </w:rPr>
-        <w:t>Accuracy final en prueba:</w:t>
-      </w:r>
-      <w:r>
-        <w:t xml:space="preserve"> [completar con el valor </w:t>
-      </w:r>
-      <w:r>
-        <w:rPr>
-          <w:rFonts w:ascii="Consolas" w:hAnsi="Consolas"/>
-          <w:sz w:val="18"/>
-        </w:rPr>
-        <w:t>Test Accuracy</w:t>
-      </w:r>
-      <w:r>
-        <w:t xml:space="preserve"> de la terminal]</w:t>
+        <w:t>Accuracy final en prueba: 0.7337 (73.37 %).</w:t>
       </w:r>
     </w:p>
     <w:p>
       <w:r>
-        <w:rPr>
-          <w:b/>
-        </w:rPr>
-        <w:t>Mejor accuracy de validación:</w:t>
-      </w:r>
-      <w:r>
-        <w:t xml:space="preserve"> [completar]</w:t>
-      </w:r>
-    </w:p>
-    <w:p>
-      <w:r>
-        <w:rPr>
-          <w:b/>
-        </w:rPr>
-        <w:t>Época con mejor validación:</w:t>
-      </w:r>
-      <w:r>
-        <w:t xml:space="preserve"> [completar]</w:t>
+        <w:t>La pérdida de entrenamiento disminuyó en cada época y su accuracy aumentó. Las métricas de validación mejoraron en general, aunque en la época 7 la pérdida subió de 0.8623 a 0.8860 y la accuracy bajó de 0.7011 a 0.6896; ambas se recuperaron en la época 8. La diferencia final entre accuracy de entrenamiento y validación fue 0.0234 (2.34 puntos porcentuales). En conjunto, hay una oscilación puntual compatible con una señal moderada de sobreajuste, pero no una brecha grande al final. La accuracy de prueba de 73.37 % indica que el modelo clasificó correctamente alrededor de siete de cada diez imágenes de prueba.</w:t>
       </w:r>
     </w:p>
     <w:p>
       <w:pPr>
-        <w:pStyle w:val="Heading2"/>
+        <w:pStyle w:val="Heading1"/>
       </w:pPr>
       <w:r>
-        <w:t>Artefactos gráficos</w:t>
+        <w:t>Artefactos</w:t>
       </w:r>
     </w:p>
     <w:p>
@@ -2336,14 +1964,7 @@
         <w:pStyle w:val="ListBullet"/>
       </w:pPr>
       <w:r>
-        <w:rPr>
-          <w:rFonts w:ascii="Consolas" w:hAnsi="Consolas"/>
-          <w:sz w:val="18"/>
-        </w:rPr>
-        <w:t>outputs/dataset_samples.png</w:t>
-      </w:r>
-      <w:r>
-        <w:t>: muestra ejemplos del dataset y sus etiquetas.</w:t>
+        <w:t>Muestras del dataset</w:t>
       </w:r>
     </w:p>
     <w:p>
@@ -2351,14 +1972,7 @@
         <w:pStyle w:val="ListBullet"/>
       </w:pPr>
       <w:r>
-        <w:rPr>
-          <w:rFonts w:ascii="Consolas" w:hAnsi="Consolas"/>
-          <w:sz w:val="18"/>
-        </w:rPr>
-        <w:t>outputs/loss_accuracy.png</w:t>
-      </w:r>
-      <w:r>
-        <w:t>: compara pérdida y accuracy de entrenamiento y validación por época.</w:t>
+        <w:t>Curvas de pérdida y accuracy</w:t>
       </w:r>
     </w:p>
     <w:p>
@@ -2366,14 +1980,7 @@
         <w:pStyle w:val="ListBullet"/>
       </w:pPr>
       <w:r>
-        <w:rPr>
-          <w:rFonts w:ascii="Consolas" w:hAnsi="Consolas"/>
-          <w:sz w:val="18"/>
-        </w:rPr>
-        <w:t>outputs/confusion_matrix.png</w:t>
-      </w:r>
-      <w:r>
-        <w:t>: muestra las predicciones del conjunto de prueba frente a las etiquetas reales.</w:t>
+        <w:t>Matriz de confusión</w:t>
       </w:r>
     </w:p>
     <w:p>
@@ -2381,156 +1988,15 @@
         <w:pStyle w:val="Heading1"/>
       </w:pPr>
       <w:r>
-        <w:t>8. Análisis de resultados</w:t>
+        <w:t>Ejecución</w:t>
       </w:r>
     </w:p>
     <w:p>
       <w:r>
-        <w:t>Completar este análisis después de observar las métricas y las gráficas:</w:t>
+        <w:t>Desde la carpeta del proyecto:</w:t>
       </w:r>
     </w:p>
     <w:p>
-      <w:pPr>
-        <w:pStyle w:val="ListBullet"/>
-      </w:pPr>
-      <w:r>
-        <w:rPr>
-          <w:b/>
-        </w:rPr>
-        <w:t>Aprendizaje:</w:t>
-      </w:r>
-      <w:r>
-        <w:t xml:space="preserve"> describir si la pérdida de entrenamiento disminuye y si la accuracy aumenta durante las épocas.</w:t>
-      </w:r>
-    </w:p>
-    <w:p>
-      <w:pPr>
-        <w:pStyle w:val="ListBullet"/>
-      </w:pPr>
-      <w:r>
-        <w:rPr>
-          <w:b/>
-        </w:rPr>
-        <w:t>Generalización:</w:t>
-      </w:r>
-      <w:r>
-        <w:t xml:space="preserve"> comparar entrenamiento y validación. Una diferencia grande y creciente, en especial si empeora la pérdida de validación mientras mejora la de entrenamiento, puede indicar sobreajuste.</w:t>
-      </w:r>
-    </w:p>
-    <w:p>
-      <w:pPr>
-        <w:pStyle w:val="ListBullet"/>
-      </w:pPr>
-      <w:r>
-        <w:rPr>
-          <w:b/>
-        </w:rPr>
-        <w:t>Subajuste:</w:t>
-      </w:r>
-      <w:r>
-        <w:t xml:space="preserve"> si las métricas de entrenamiento y validación permanecen ambas bajas y las pérdidas altas, el modelo podría no haber aprendido suficientemente los patrones.</w:t>
-      </w:r>
-    </w:p>
-    <w:p>
-      <w:pPr>
-        <w:pStyle w:val="ListBullet"/>
-      </w:pPr>
-      <w:r>
-        <w:rPr>
-          <w:b/>
-        </w:rPr>
-        <w:t>Prueba:</w:t>
-      </w:r>
-      <w:r>
-        <w:t xml:space="preserve"> interpretar </w:t>
-      </w:r>
-      <w:r>
-        <w:rPr>
-          <w:rFonts w:ascii="Consolas" w:hAnsi="Consolas"/>
-          <w:sz w:val="18"/>
-        </w:rPr>
-        <w:t>Test Accuracy</w:t>
-      </w:r>
-      <w:r>
-        <w:t xml:space="preserve"> como la proporción de imágenes correctamente clasificadas en el conjunto de prueba independiente.</w:t>
-      </w:r>
-    </w:p>
-    <w:p>
-      <w:pPr>
-        <w:pStyle w:val="ListBullet"/>
-      </w:pPr>
-      <w:r>
-        <w:rPr>
-          <w:b/>
-        </w:rPr>
-        <w:t>Matriz de confusión:</w:t>
-      </w:r>
-      <w:r>
-        <w:t xml:space="preserve"> identificar las clases con más aciertos y los pares de categorías que más se confunden. Las cifras de la diagonal principal son aciertos.</w:t>
-      </w:r>
-    </w:p>
-    <w:p>
-      <w:r>
-        <w:rPr>
-          <w:b/>
-        </w:rPr>
-        <w:t>Análisis con valores observados:</w:t>
-      </w:r>
-    </w:p>
-    <w:p>
-      <w:r>
-        <w:t>[Escribe aquí la comparación cuantitativa entre la última época de entrenamiento y validación, el resultado de prueba y las confusiones visibles en la matriz. No concluyas sobre overfitting o underfitting hasta revisar esos datos.]</w:t>
-      </w:r>
-    </w:p>
-    <w:p>
-      <w:pPr>
-        <w:pStyle w:val="Heading1"/>
-      </w:pPr>
-      <w:r>
-        <w:t>9. Conclusiones</w:t>
-      </w:r>
-    </w:p>
-    <w:p>
-      <w:r>
-        <w:t xml:space="preserve">La evaluación permitió implementar el flujo de preparación de CIFAR-10, una CNN de dos bloques convolucionales y la validación explícita de las formas de los tensores. El resultado final del clasificador fue </w:t>
-      </w:r>
-      <w:r>
-        <w:rPr>
-          <w:b/>
-        </w:rPr>
-        <w:t>[completar] %</w:t>
-      </w:r>
-      <w:r>
-        <w:t xml:space="preserve"> de accuracy sobre prueba. De acuerdo con las curvas y la matriz de confusión, </w:t>
-      </w:r>
-      <w:r>
-        <w:rPr>
-          <w:b/>
-        </w:rPr>
-        <w:t>[completar conclusión basada en los resultados reales]</w:t>
-      </w:r>
-      <w:r>
-        <w:t>.</w:t>
-      </w:r>
-    </w:p>
-    <w:p>
-      <w:pPr>
-        <w:pStyle w:val="Heading1"/>
-      </w:pPr>
-      <w:r>
-        <w:t>10. Cómo ejecutar el proyecto</w:t>
-      </w:r>
-    </w:p>
-    <w:p>
-      <w:r>
-        <w:t>Desde la carpeta nombres_repositorio, ejecutar en PowerShell:</w:t>
-      </w:r>
-    </w:p>
-    <w:p>
-      <w:pPr>
-        <w:spacing w:after="20"/>
-        <w:ind w:left="360"/>
-      </w:pPr>
       <w:r>
         <w:rPr>
           <w:rFonts w:ascii="Consolas" w:hAnsi="Consolas"/>
@@ -2540,10 +2006,6 @@
       </w:r>
     </w:p>
     <w:p>
-      <w:pPr>
-        <w:spacing w:after="20"/>
-        <w:ind w:left="360"/>
-      </w:pPr>
       <w:r>
         <w:rPr>
           <w:rFonts w:ascii="Consolas" w:hAnsi="Consolas"/>
@@ -2553,10 +2015,6 @@
       </w:r>
     </w:p>
     <w:p>
-      <w:pPr>
-        <w:spacing w:after="20"/>
-        <w:ind w:left="360"/>
-      </w:pPr>
       <w:r>
         <w:rPr>
           <w:rFonts w:ascii="Consolas" w:hAnsi="Consolas"/>
@@ -2567,7 +2025,7 @@
     </w:p>
     <w:p>
       <w:r>
-        <w:t>La primera ejecución descarga CIFAR-10 y requiere conexión a internet. El entrenamiento puede tardar varios minutos, especialmente si se ejecuta en CPU.</w:t>
+        <w:t>La primera ejecución descarga CIFAR-10 y requiere conexión a internet.</w:t>
       </w:r>
     </w:p>
     <w:p>
@@ -2575,17 +2033,12 @@
         <w:pStyle w:val="Heading1"/>
       </w:pPr>
       <w:r>
-        <w:t>11. Repositorio</w:t>
+        <w:t>Repositorio</w:t>
       </w:r>
     </w:p>
     <w:p>
       <w:r>
-        <w:t>Enlace publico de GitHub: https://github.com/chava454/nombres_repositorio</w:t>
-      </w:r>
-    </w:p>
-    <w:p>
-      <w:r>
-        <w:t>Antes de entregar, verificar que el repositorio sea público y que incluya el código, el notebook, el informe, el README y los artefactos gráficos requeridos. No subir el dataset descargado salvo que el docente lo solicite.</w:t>
+        <w:t>https://github.com/chava454/nombres_repositorio</w:t>
       </w:r>
     </w:p>
     <w:sectPr>
@@ -2981,9 +2434,6 @@
     <w:name w:val="Normal"/>
     <w:qFormat/>
     <w:rsid w:val="00FC693F"/>
-    <w:pPr>
-      <w:spacing w:after="100"/>
-    </w:pPr>
     <w:rPr>
       <w:rFonts w:ascii="Arial" w:hAnsi="Arial"/>
       <w:sz w:val="21"/>
@@ -3096,11 +2546,10 @@
       <w:outlineLvl w:val="2"/>
     </w:pPr>
     <w:rPr>
-      <w:rFonts w:asciiTheme="majorHAnsi" w:eastAsiaTheme="majorEastAsia" w:hAnsiTheme="majorHAnsi" w:cstheme="majorBidi" w:ascii="Arial" w:hAnsi="Arial"/>
+      <w:rFonts w:asciiTheme="majorHAnsi" w:eastAsiaTheme="majorEastAsia" w:hAnsiTheme="majorHAnsi" w:cstheme="majorBidi"/>
       <w:b/>
       <w:bCs/>
-      <w:color w:val="2F5597"/>
-      <w:sz w:val="22"/>
+      <w:color w:val="4F81BD" w:themeColor="accent1"/>
     </w:rPr>
   </w:style>
   <w:style w:type="paragraph" w:styleId="Heading4">

</xml_diff>